<commit_message>
update workplan for MCP
</commit_message>
<xml_diff>
--- a/Agentic_WorkPlan_v2.docx
+++ b/Agentic_WorkPlan_v2.docx
@@ -609,7 +609,7 @@
           <w:sz w:val="22"/>
           <w:szCs w:val="22"/>
         </w:rPr>
-        <w:t xml:space="preserve">Hệ thống gồm 4 service độc lập, giao tiếp qua A2A và MCP, deploy bằng Docker Compose:</w:t>
+        <w:t xml:space="preserve">Hệ thống gồm 4 service độc lập, giao tiếp qua A2A và Tool Registry HTTP API, deploy bằng Docker Compose:</w:t>
       </w:r>
     </w:p>
     <w:tbl>
@@ -1044,7 +1044,7 @@
                 <w:sz w:val="19"/>
                 <w:szCs w:val="19"/>
               </w:rPr>
-              <w:t xml:space="preserve">MCP (HTTP)</w:t>
+              <w:t xml:space="preserve">HTTP REST</w:t>
             </w:r>
           </w:p>
         </w:tc>
@@ -1195,7 +1195,7 @@
                 <w:sz w:val="19"/>
                 <w:szCs w:val="19"/>
               </w:rPr>
-              <w:t xml:space="preserve">A2A + MCP</w:t>
+              <w:t xml:space="preserve">A2A + HTTP</w:t>
             </w:r>
           </w:p>
         </w:tc>
@@ -1346,7 +1346,7 @@
                 <w:sz w:val="19"/>
                 <w:szCs w:val="19"/>
               </w:rPr>
-              <w:t xml:space="preserve">A2A + MCP</w:t>
+              <w:t xml:space="preserve">A2A + HTTP</w:t>
             </w:r>
           </w:p>
         </w:tc>
@@ -1550,7 +1550,7 @@
                 <w:sz w:val="22"/>
                 <w:szCs w:val="22"/>
               </w:rPr>
-              <w:t xml:space="preserve">MCP — GET /tools?namespace=X  +  POST /tools/{name}/execute</w:t>
+              <w:t xml:space="preserve">HTTP REST — GET /tools?namespace=X  +  POST /tools/{name}/execute  (MCP-compatible convention, không dùng MCP SDK)</w:t>
             </w:r>
           </w:p>
           <w:p>
@@ -1583,6 +1583,863 @@
                 <w:szCs w:val="22"/>
               </w:rPr>
               <w:t xml:space="preserve">Bearer token forward qua HTTP header xuyên suốt chuỗi — không lưu, không biến đổi</w:t>
+            </w:r>
+          </w:p>
+        </w:tc>
+      </w:tr>
+    </w:tbl>
+    <w:p>
+      <w:pPr>
+        <w:spacing w:after="160" w:before="0"/>
+      </w:pPr>
+      <w:r>
+        <w:rPr>
+          <w:rFonts w:ascii="Arial" w:cs="Arial" w:eastAsia="Arial" w:hAnsi="Arial"/>
+          <w:b w:val="false"/>
+          <w:bCs w:val="false"/>
+          <w:i w:val="false"/>
+          <w:iCs w:val="false"/>
+          <w:color w:val="1E293B"/>
+          <w:sz w:val="22"/>
+          <w:szCs w:val="22"/>
+        </w:rPr>
+        <w:t xml:space="preserve"/>
+      </w:r>
+    </w:p>
+    <w:p>
+      <w:pPr>
+        <w:pStyle w:val="Heading2"/>
+        <w:spacing w:after="120" w:before="280"/>
+      </w:pPr>
+      <w:r>
+        <w:rPr>
+          <w:rFonts w:ascii="Arial" w:cs="Arial" w:eastAsia="Arial" w:hAnsi="Arial"/>
+          <w:b/>
+          <w:bCs/>
+          <w:color w:val="2B5278"/>
+          <w:sz w:val="26"/>
+          <w:szCs w:val="26"/>
+        </w:rPr>
+        <w:t xml:space="preserve">1.1.1 Quyết Định Kiến Trúc — Không Dùng MCP SDK Cho MVP</w:t>
+      </w:r>
+    </w:p>
+    <w:tbl>
+      <w:tblPr>
+        <w:tblW w:type="dxa" w:w="9360"/>
+        <w:tblBorders>
+          <w:top w:val="single" w:color="auto" w:sz="4"/>
+          <w:left w:val="single" w:color="auto" w:sz="4"/>
+          <w:bottom w:val="single" w:color="auto" w:sz="4"/>
+          <w:right w:val="single" w:color="auto" w:sz="4"/>
+          <w:insideH w:val="single" w:color="auto" w:sz="4"/>
+          <w:insideV w:val="single" w:color="auto" w:sz="4"/>
+        </w:tblBorders>
+      </w:tblPr>
+      <w:tblGrid>
+        <w:gridCol w:w="2800"/>
+        <w:gridCol w:w="3200"/>
+        <w:gridCol w:w="3360"/>
+      </w:tblGrid>
+      <w:tr>
+        <w:tc>
+          <w:tcPr>
+            <w:tcW w:type="dxa" w:w="2800"/>
+            <w:tcBorders>
+              <w:top w:val="single" w:color="CBD5E1" w:sz="1"/>
+              <w:left w:val="single" w:color="CBD5E1" w:sz="1"/>
+              <w:bottom w:val="single" w:color="CBD5E1" w:sz="1"/>
+              <w:right w:val="single" w:color="CBD5E1" w:sz="1"/>
+            </w:tcBorders>
+            <w:shd w:fill="1E3A5F" w:val="clear"/>
+            <w:tcMar>
+              <w:top w:type="dxa" w:w="90"/>
+              <w:left w:type="dxa" w:w="140"/>
+              <w:bottom w:type="dxa" w:w="90"/>
+              <w:right w:type="dxa" w:w="140"/>
+            </w:tcMar>
+            <w:vAlign w:val="top"/>
+          </w:tcPr>
+          <w:p>
+            <w:pPr>
+              <w:spacing w:after="0" w:before="0"/>
+              <w:jc w:val="center"/>
+            </w:pPr>
+            <w:r>
+              <w:rPr>
+                <w:rFonts w:ascii="Arial" w:cs="Arial" w:eastAsia="Arial" w:hAnsi="Arial"/>
+                <w:b/>
+                <w:bCs/>
+                <w:i w:val="false"/>
+                <w:iCs w:val="false"/>
+                <w:color w:val="FFFFFF"/>
+                <w:sz w:val="18"/>
+                <w:szCs w:val="18"/>
+              </w:rPr>
+              <w:t xml:space="preserve"/>
+            </w:r>
+          </w:p>
+        </w:tc>
+        <w:tc>
+          <w:tcPr>
+            <w:tcW w:type="dxa" w:w="3200"/>
+            <w:tcBorders>
+              <w:top w:val="single" w:color="CBD5E1" w:sz="1"/>
+              <w:left w:val="single" w:color="CBD5E1" w:sz="1"/>
+              <w:bottom w:val="single" w:color="CBD5E1" w:sz="1"/>
+              <w:right w:val="single" w:color="CBD5E1" w:sz="1"/>
+            </w:tcBorders>
+            <w:shd w:fill="1E3A5F" w:val="clear"/>
+            <w:tcMar>
+              <w:top w:type="dxa" w:w="90"/>
+              <w:left w:type="dxa" w:w="140"/>
+              <w:bottom w:type="dxa" w:w="90"/>
+              <w:right w:type="dxa" w:w="140"/>
+            </w:tcMar>
+            <w:vAlign w:val="top"/>
+          </w:tcPr>
+          <w:p>
+            <w:pPr>
+              <w:spacing w:after="0" w:before="0"/>
+              <w:jc w:val="center"/>
+            </w:pPr>
+            <w:r>
+              <w:rPr>
+                <w:rFonts w:ascii="Arial" w:cs="Arial" w:eastAsia="Arial" w:hAnsi="Arial"/>
+                <w:b/>
+                <w:bCs/>
+                <w:i w:val="false"/>
+                <w:iCs w:val="false"/>
+                <w:color w:val="FFFFFF"/>
+                <w:sz w:val="18"/>
+                <w:szCs w:val="18"/>
+              </w:rPr>
+              <w:t xml:space="preserve">MCP SDK chính thức</w:t>
+            </w:r>
+          </w:p>
+        </w:tc>
+        <w:tc>
+          <w:tcPr>
+            <w:tcW w:type="dxa" w:w="3360"/>
+            <w:tcBorders>
+              <w:top w:val="single" w:color="CBD5E1" w:sz="1"/>
+              <w:left w:val="single" w:color="CBD5E1" w:sz="1"/>
+              <w:bottom w:val="single" w:color="CBD5E1" w:sz="1"/>
+              <w:right w:val="single" w:color="CBD5E1" w:sz="1"/>
+            </w:tcBorders>
+            <w:shd w:fill="1E3A5F" w:val="clear"/>
+            <w:tcMar>
+              <w:top w:type="dxa" w:w="90"/>
+              <w:left w:type="dxa" w:w="140"/>
+              <w:bottom w:type="dxa" w:w="90"/>
+              <w:right w:type="dxa" w:w="140"/>
+            </w:tcMar>
+            <w:vAlign w:val="top"/>
+          </w:tcPr>
+          <w:p>
+            <w:pPr>
+              <w:spacing w:after="0" w:before="0"/>
+              <w:jc w:val="center"/>
+            </w:pPr>
+            <w:r>
+              <w:rPr>
+                <w:rFonts w:ascii="Arial" w:cs="Arial" w:eastAsia="Arial" w:hAnsi="Arial"/>
+                <w:b/>
+                <w:bCs/>
+                <w:i w:val="false"/>
+                <w:iCs w:val="false"/>
+                <w:color w:val="FFFFFF"/>
+                <w:sz w:val="18"/>
+                <w:szCs w:val="18"/>
+              </w:rPr>
+              <w:t xml:space="preserve">HTTP REST (lựa chọn MVP)</w:t>
+            </w:r>
+          </w:p>
+        </w:tc>
+      </w:tr>
+      <w:tr>
+        <w:tc>
+          <w:tcPr>
+            <w:tcW w:type="dxa" w:w="2800"/>
+            <w:tcBorders>
+              <w:top w:val="single" w:color="CBD5E1" w:sz="1"/>
+              <w:left w:val="single" w:color="CBD5E1" w:sz="1"/>
+              <w:bottom w:val="single" w:color="CBD5E1" w:sz="1"/>
+              <w:right w:val="single" w:color="CBD5E1" w:sz="1"/>
+            </w:tcBorders>
+            <w:shd w:fill="F1F5F9" w:val="clear"/>
+            <w:tcMar>
+              <w:top w:type="dxa" w:w="90"/>
+              <w:left w:type="dxa" w:w="140"/>
+              <w:bottom w:type="dxa" w:w="90"/>
+              <w:right w:type="dxa" w:w="140"/>
+            </w:tcMar>
+            <w:vAlign w:val="top"/>
+          </w:tcPr>
+          <w:p>
+            <w:pPr>
+              <w:spacing w:after="0" w:before="0"/>
+              <w:jc w:val="left"/>
+            </w:pPr>
+            <w:r>
+              <w:rPr>
+                <w:rFonts w:ascii="Arial" w:cs="Arial" w:eastAsia="Arial" w:hAnsi="Arial"/>
+                <w:b/>
+                <w:bCs/>
+                <w:i w:val="false"/>
+                <w:iCs w:val="false"/>
+                <w:color w:val="1E293B"/>
+                <w:sz w:val="20"/>
+                <w:szCs w:val="20"/>
+              </w:rPr>
+              <w:t xml:space="preserve">Tool discovery</w:t>
+            </w:r>
+          </w:p>
+        </w:tc>
+        <w:tc>
+          <w:tcPr>
+            <w:tcW w:type="dxa" w:w="3200"/>
+            <w:tcBorders>
+              <w:top w:val="single" w:color="CBD5E1" w:sz="1"/>
+              <w:left w:val="single" w:color="CBD5E1" w:sz="1"/>
+              <w:bottom w:val="single" w:color="CBD5E1" w:sz="1"/>
+              <w:right w:val="single" w:color="CBD5E1" w:sz="1"/>
+            </w:tcBorders>
+            <w:tcMar>
+              <w:top w:type="dxa" w:w="90"/>
+              <w:left w:type="dxa" w:w="140"/>
+              <w:bottom w:type="dxa" w:w="90"/>
+              <w:right w:type="dxa" w:w="140"/>
+            </w:tcMar>
+            <w:vAlign w:val="top"/>
+          </w:tcPr>
+          <w:p>
+            <w:pPr>
+              <w:spacing w:after="0" w:before="0"/>
+              <w:jc w:val="left"/>
+            </w:pPr>
+            <w:r>
+              <w:rPr>
+                <w:rFonts w:ascii="Arial" w:cs="Arial" w:eastAsia="Arial" w:hAnsi="Arial"/>
+                <w:b w:val="false"/>
+                <w:bCs w:val="false"/>
+                <w:i w:val="false"/>
+                <w:iCs w:val="false"/>
+                <w:color w:val="1E293B"/>
+                <w:sz w:val="19"/>
+                <w:szCs w:val="19"/>
+              </w:rPr>
+              <w:t xml:space="preserve">MCP transport (stdio / SSE / HTTP stream)</w:t>
+            </w:r>
+          </w:p>
+        </w:tc>
+        <w:tc>
+          <w:tcPr>
+            <w:tcW w:type="dxa" w:w="3360"/>
+            <w:tcBorders>
+              <w:top w:val="single" w:color="CBD5E1" w:sz="1"/>
+              <w:left w:val="single" w:color="CBD5E1" w:sz="1"/>
+              <w:bottom w:val="single" w:color="CBD5E1" w:sz="1"/>
+              <w:right w:val="single" w:color="CBD5E1" w:sz="1"/>
+            </w:tcBorders>
+            <w:tcMar>
+              <w:top w:type="dxa" w:w="90"/>
+              <w:left w:type="dxa" w:w="140"/>
+              <w:bottom w:type="dxa" w:w="90"/>
+              <w:right w:type="dxa" w:w="140"/>
+            </w:tcMar>
+            <w:vAlign w:val="top"/>
+          </w:tcPr>
+          <w:p>
+            <w:pPr>
+              <w:spacing w:after="0" w:before="0"/>
+              <w:jc w:val="left"/>
+            </w:pPr>
+            <w:r>
+              <w:rPr>
+                <w:rFonts w:ascii="Arial" w:cs="Arial" w:eastAsia="Arial" w:hAnsi="Arial"/>
+                <w:b w:val="false"/>
+                <w:bCs w:val="false"/>
+                <w:i w:val="false"/>
+                <w:iCs w:val="false"/>
+                <w:color w:val="1E293B"/>
+                <w:sz w:val="19"/>
+                <w:szCs w:val="19"/>
+              </w:rPr>
+              <w:t xml:space="preserve">GET /tools?namespace=X → JSON (đủ rồi)</w:t>
+            </w:r>
+          </w:p>
+        </w:tc>
+      </w:tr>
+      <w:tr>
+        <w:tc>
+          <w:tcPr>
+            <w:tcW w:type="dxa" w:w="2800"/>
+            <w:tcBorders>
+              <w:top w:val="single" w:color="CBD5E1" w:sz="1"/>
+              <w:left w:val="single" w:color="CBD5E1" w:sz="1"/>
+              <w:bottom w:val="single" w:color="CBD5E1" w:sz="1"/>
+              <w:right w:val="single" w:color="CBD5E1" w:sz="1"/>
+            </w:tcBorders>
+            <w:shd w:fill="F1F5F9" w:val="clear"/>
+            <w:tcMar>
+              <w:top w:type="dxa" w:w="90"/>
+              <w:left w:type="dxa" w:w="140"/>
+              <w:bottom w:type="dxa" w:w="90"/>
+              <w:right w:type="dxa" w:w="140"/>
+            </w:tcMar>
+            <w:vAlign w:val="top"/>
+          </w:tcPr>
+          <w:p>
+            <w:pPr>
+              <w:spacing w:after="0" w:before="0"/>
+              <w:jc w:val="left"/>
+            </w:pPr>
+            <w:r>
+              <w:rPr>
+                <w:rFonts w:ascii="Arial" w:cs="Arial" w:eastAsia="Arial" w:hAnsi="Arial"/>
+                <w:b/>
+                <w:bCs/>
+                <w:i w:val="false"/>
+                <w:iCs w:val="false"/>
+                <w:color w:val="1E293B"/>
+                <w:sz w:val="20"/>
+                <w:szCs w:val="20"/>
+              </w:rPr>
+              <w:t xml:space="preserve">Tool execution</w:t>
+            </w:r>
+          </w:p>
+        </w:tc>
+        <w:tc>
+          <w:tcPr>
+            <w:tcW w:type="dxa" w:w="3200"/>
+            <w:tcBorders>
+              <w:top w:val="single" w:color="CBD5E1" w:sz="1"/>
+              <w:left w:val="single" w:color="CBD5E1" w:sz="1"/>
+              <w:bottom w:val="single" w:color="CBD5E1" w:sz="1"/>
+              <w:right w:val="single" w:color="CBD5E1" w:sz="1"/>
+            </w:tcBorders>
+            <w:tcMar>
+              <w:top w:type="dxa" w:w="90"/>
+              <w:left w:type="dxa" w:w="140"/>
+              <w:bottom w:type="dxa" w:w="90"/>
+              <w:right w:type="dxa" w:w="140"/>
+            </w:tcMar>
+            <w:vAlign w:val="top"/>
+          </w:tcPr>
+          <w:p>
+            <w:pPr>
+              <w:spacing w:after="0" w:before="0"/>
+              <w:jc w:val="left"/>
+            </w:pPr>
+            <w:r>
+              <w:rPr>
+                <w:rFonts w:ascii="Arial" w:cs="Arial" w:eastAsia="Arial" w:hAnsi="Arial"/>
+                <w:b w:val="false"/>
+                <w:bCs w:val="false"/>
+                <w:i w:val="false"/>
+                <w:iCs w:val="false"/>
+                <w:color w:val="1E293B"/>
+                <w:sz w:val="19"/>
+                <w:szCs w:val="19"/>
+              </w:rPr>
+              <w:t xml:space="preserve">MCP protocol message format</w:t>
+            </w:r>
+          </w:p>
+        </w:tc>
+        <w:tc>
+          <w:tcPr>
+            <w:tcW w:type="dxa" w:w="3360"/>
+            <w:tcBorders>
+              <w:top w:val="single" w:color="CBD5E1" w:sz="1"/>
+              <w:left w:val="single" w:color="CBD5E1" w:sz="1"/>
+              <w:bottom w:val="single" w:color="CBD5E1" w:sz="1"/>
+              <w:right w:val="single" w:color="CBD5E1" w:sz="1"/>
+            </w:tcBorders>
+            <w:tcMar>
+              <w:top w:type="dxa" w:w="90"/>
+              <w:left w:type="dxa" w:w="140"/>
+              <w:bottom w:type="dxa" w:w="90"/>
+              <w:right w:type="dxa" w:w="140"/>
+            </w:tcMar>
+            <w:vAlign w:val="top"/>
+          </w:tcPr>
+          <w:p>
+            <w:pPr>
+              <w:spacing w:after="0" w:before="0"/>
+              <w:jc w:val="left"/>
+            </w:pPr>
+            <w:r>
+              <w:rPr>
+                <w:rFonts w:ascii="Arial" w:cs="Arial" w:eastAsia="Arial" w:hAnsi="Arial"/>
+                <w:b w:val="false"/>
+                <w:bCs w:val="false"/>
+                <w:i w:val="false"/>
+                <w:iCs w:val="false"/>
+                <w:color w:val="1E293B"/>
+                <w:sz w:val="19"/>
+                <w:szCs w:val="19"/>
+              </w:rPr>
+              <w:t xml:space="preserve">POST /tools/{name}/execute → JSON (đủ rồi)</w:t>
+            </w:r>
+          </w:p>
+        </w:tc>
+      </w:tr>
+      <w:tr>
+        <w:tc>
+          <w:tcPr>
+            <w:tcW w:type="dxa" w:w="2800"/>
+            <w:tcBorders>
+              <w:top w:val="single" w:color="CBD5E1" w:sz="1"/>
+              <w:left w:val="single" w:color="CBD5E1" w:sz="1"/>
+              <w:bottom w:val="single" w:color="CBD5E1" w:sz="1"/>
+              <w:right w:val="single" w:color="CBD5E1" w:sz="1"/>
+            </w:tcBorders>
+            <w:shd w:fill="F1F5F9" w:val="clear"/>
+            <w:tcMar>
+              <w:top w:type="dxa" w:w="90"/>
+              <w:left w:type="dxa" w:w="140"/>
+              <w:bottom w:type="dxa" w:w="90"/>
+              <w:right w:type="dxa" w:w="140"/>
+            </w:tcMar>
+            <w:vAlign w:val="top"/>
+          </w:tcPr>
+          <w:p>
+            <w:pPr>
+              <w:spacing w:after="0" w:before="0"/>
+              <w:jc w:val="left"/>
+            </w:pPr>
+            <w:r>
+              <w:rPr>
+                <w:rFonts w:ascii="Arial" w:cs="Arial" w:eastAsia="Arial" w:hAnsi="Arial"/>
+                <w:b/>
+                <w:bCs/>
+                <w:i w:val="false"/>
+                <w:iCs w:val="false"/>
+                <w:color w:val="1E293B"/>
+                <w:sz w:val="20"/>
+                <w:szCs w:val="20"/>
+              </w:rPr>
+              <w:t xml:space="preserve">Dependency</w:t>
+            </w:r>
+          </w:p>
+        </w:tc>
+        <w:tc>
+          <w:tcPr>
+            <w:tcW w:type="dxa" w:w="3200"/>
+            <w:tcBorders>
+              <w:top w:val="single" w:color="CBD5E1" w:sz="1"/>
+              <w:left w:val="single" w:color="CBD5E1" w:sz="1"/>
+              <w:bottom w:val="single" w:color="CBD5E1" w:sz="1"/>
+              <w:right w:val="single" w:color="CBD5E1" w:sz="1"/>
+            </w:tcBorders>
+            <w:tcMar>
+              <w:top w:type="dxa" w:w="90"/>
+              <w:left w:type="dxa" w:w="140"/>
+              <w:bottom w:type="dxa" w:w="90"/>
+              <w:right w:type="dxa" w:w="140"/>
+            </w:tcMar>
+            <w:vAlign w:val="top"/>
+          </w:tcPr>
+          <w:p>
+            <w:pPr>
+              <w:spacing w:after="0" w:before="0"/>
+              <w:jc w:val="left"/>
+            </w:pPr>
+            <w:r>
+              <w:rPr>
+                <w:rFonts w:ascii="Arial" w:cs="Arial" w:eastAsia="Arial" w:hAnsi="Arial"/>
+                <w:b w:val="false"/>
+                <w:bCs w:val="false"/>
+                <w:i w:val="false"/>
+                <w:iCs w:val="false"/>
+                <w:color w:val="1E293B"/>
+                <w:sz w:val="19"/>
+                <w:szCs w:val="19"/>
+              </w:rPr>
+              <w:t xml:space="preserve">mcp SDK, transport layer, protocol spec</w:t>
+            </w:r>
+          </w:p>
+        </w:tc>
+        <w:tc>
+          <w:tcPr>
+            <w:tcW w:type="dxa" w:w="3360"/>
+            <w:tcBorders>
+              <w:top w:val="single" w:color="CBD5E1" w:sz="1"/>
+              <w:left w:val="single" w:color="CBD5E1" w:sz="1"/>
+              <w:bottom w:val="single" w:color="CBD5E1" w:sz="1"/>
+              <w:right w:val="single" w:color="CBD5E1" w:sz="1"/>
+            </w:tcBorders>
+            <w:tcMar>
+              <w:top w:type="dxa" w:w="90"/>
+              <w:left w:type="dxa" w:w="140"/>
+              <w:bottom w:type="dxa" w:w="90"/>
+              <w:right w:type="dxa" w:w="140"/>
+            </w:tcMar>
+            <w:vAlign w:val="top"/>
+          </w:tcPr>
+          <w:p>
+            <w:pPr>
+              <w:spacing w:after="0" w:before="0"/>
+              <w:jc w:val="left"/>
+            </w:pPr>
+            <w:r>
+              <w:rPr>
+                <w:rFonts w:ascii="Arial" w:cs="Arial" w:eastAsia="Arial" w:hAnsi="Arial"/>
+                <w:b w:val="false"/>
+                <w:bCs w:val="false"/>
+                <w:i w:val="false"/>
+                <w:iCs w:val="false"/>
+                <w:color w:val="1E293B"/>
+                <w:sz w:val="19"/>
+                <w:szCs w:val="19"/>
+              </w:rPr>
+              <w:t xml:space="preserve">httpx — đã có sẵn trong stack</w:t>
+            </w:r>
+          </w:p>
+        </w:tc>
+      </w:tr>
+      <w:tr>
+        <w:tc>
+          <w:tcPr>
+            <w:tcW w:type="dxa" w:w="2800"/>
+            <w:tcBorders>
+              <w:top w:val="single" w:color="CBD5E1" w:sz="1"/>
+              <w:left w:val="single" w:color="CBD5E1" w:sz="1"/>
+              <w:bottom w:val="single" w:color="CBD5E1" w:sz="1"/>
+              <w:right w:val="single" w:color="CBD5E1" w:sz="1"/>
+            </w:tcBorders>
+            <w:shd w:fill="F1F5F9" w:val="clear"/>
+            <w:tcMar>
+              <w:top w:type="dxa" w:w="90"/>
+              <w:left w:type="dxa" w:w="140"/>
+              <w:bottom w:type="dxa" w:w="90"/>
+              <w:right w:type="dxa" w:w="140"/>
+            </w:tcMar>
+            <w:vAlign w:val="top"/>
+          </w:tcPr>
+          <w:p>
+            <w:pPr>
+              <w:spacing w:after="0" w:before="0"/>
+              <w:jc w:val="left"/>
+            </w:pPr>
+            <w:r>
+              <w:rPr>
+                <w:rFonts w:ascii="Arial" w:cs="Arial" w:eastAsia="Arial" w:hAnsi="Arial"/>
+                <w:b/>
+                <w:bCs/>
+                <w:i w:val="false"/>
+                <w:iCs w:val="false"/>
+                <w:color w:val="1E293B"/>
+                <w:sz w:val="20"/>
+                <w:szCs w:val="20"/>
+              </w:rPr>
+              <w:t xml:space="preserve">Debug</w:t>
+            </w:r>
+          </w:p>
+        </w:tc>
+        <w:tc>
+          <w:tcPr>
+            <w:tcW w:type="dxa" w:w="3200"/>
+            <w:tcBorders>
+              <w:top w:val="single" w:color="CBD5E1" w:sz="1"/>
+              <w:left w:val="single" w:color="CBD5E1" w:sz="1"/>
+              <w:bottom w:val="single" w:color="CBD5E1" w:sz="1"/>
+              <w:right w:val="single" w:color="CBD5E1" w:sz="1"/>
+            </w:tcBorders>
+            <w:tcMar>
+              <w:top w:type="dxa" w:w="90"/>
+              <w:left w:type="dxa" w:w="140"/>
+              <w:bottom w:type="dxa" w:w="90"/>
+              <w:right w:type="dxa" w:w="140"/>
+            </w:tcMar>
+            <w:vAlign w:val="top"/>
+          </w:tcPr>
+          <w:p>
+            <w:pPr>
+              <w:spacing w:after="0" w:before="0"/>
+              <w:jc w:val="left"/>
+            </w:pPr>
+            <w:r>
+              <w:rPr>
+                <w:rFonts w:ascii="Arial" w:cs="Arial" w:eastAsia="Arial" w:hAnsi="Arial"/>
+                <w:b w:val="false"/>
+                <w:bCs w:val="false"/>
+                <w:i w:val="false"/>
+                <w:iCs w:val="false"/>
+                <w:color w:val="1E293B"/>
+                <w:sz w:val="19"/>
+                <w:szCs w:val="19"/>
+              </w:rPr>
+              <w:t xml:space="preserve">Cần hiểu MCP transport internals</w:t>
+            </w:r>
+          </w:p>
+        </w:tc>
+        <w:tc>
+          <w:tcPr>
+            <w:tcW w:type="dxa" w:w="3360"/>
+            <w:tcBorders>
+              <w:top w:val="single" w:color="CBD5E1" w:sz="1"/>
+              <w:left w:val="single" w:color="CBD5E1" w:sz="1"/>
+              <w:bottom w:val="single" w:color="CBD5E1" w:sz="1"/>
+              <w:right w:val="single" w:color="CBD5E1" w:sz="1"/>
+            </w:tcBorders>
+            <w:tcMar>
+              <w:top w:type="dxa" w:w="90"/>
+              <w:left w:type="dxa" w:w="140"/>
+              <w:bottom w:type="dxa" w:w="90"/>
+              <w:right w:type="dxa" w:w="140"/>
+            </w:tcMar>
+            <w:vAlign w:val="top"/>
+          </w:tcPr>
+          <w:p>
+            <w:pPr>
+              <w:spacing w:after="0" w:before="0"/>
+              <w:jc w:val="left"/>
+            </w:pPr>
+            <w:r>
+              <w:rPr>
+                <w:rFonts w:ascii="Arial" w:cs="Arial" w:eastAsia="Arial" w:hAnsi="Arial"/>
+                <w:b w:val="false"/>
+                <w:bCs w:val="false"/>
+                <w:i w:val="false"/>
+                <w:iCs w:val="false"/>
+                <w:color w:val="1E293B"/>
+                <w:sz w:val="19"/>
+                <w:szCs w:val="19"/>
+              </w:rPr>
+              <w:t xml:space="preserve">curl/Postman là đủ</w:t>
+            </w:r>
+          </w:p>
+        </w:tc>
+      </w:tr>
+      <w:tr>
+        <w:tc>
+          <w:tcPr>
+            <w:tcW w:type="dxa" w:w="2800"/>
+            <w:tcBorders>
+              <w:top w:val="single" w:color="CBD5E1" w:sz="1"/>
+              <w:left w:val="single" w:color="CBD5E1" w:sz="1"/>
+              <w:bottom w:val="single" w:color="CBD5E1" w:sz="1"/>
+              <w:right w:val="single" w:color="CBD5E1" w:sz="1"/>
+            </w:tcBorders>
+            <w:shd w:fill="F1F5F9" w:val="clear"/>
+            <w:tcMar>
+              <w:top w:type="dxa" w:w="90"/>
+              <w:left w:type="dxa" w:w="140"/>
+              <w:bottom w:type="dxa" w:w="90"/>
+              <w:right w:type="dxa" w:w="140"/>
+            </w:tcMar>
+            <w:vAlign w:val="top"/>
+          </w:tcPr>
+          <w:p>
+            <w:pPr>
+              <w:spacing w:after="0" w:before="0"/>
+              <w:jc w:val="left"/>
+            </w:pPr>
+            <w:r>
+              <w:rPr>
+                <w:rFonts w:ascii="Arial" w:cs="Arial" w:eastAsia="Arial" w:hAnsi="Arial"/>
+                <w:b/>
+                <w:bCs/>
+                <w:i w:val="false"/>
+                <w:iCs w:val="false"/>
+                <w:color w:val="1E293B"/>
+                <w:sz w:val="20"/>
+                <w:szCs w:val="20"/>
+              </w:rPr>
+              <w:t xml:space="preserve">Convention</w:t>
+            </w:r>
+          </w:p>
+        </w:tc>
+        <w:tc>
+          <w:tcPr>
+            <w:tcW w:type="dxa" w:w="3200"/>
+            <w:tcBorders>
+              <w:top w:val="single" w:color="CBD5E1" w:sz="1"/>
+              <w:left w:val="single" w:color="CBD5E1" w:sz="1"/>
+              <w:bottom w:val="single" w:color="CBD5E1" w:sz="1"/>
+              <w:right w:val="single" w:color="CBD5E1" w:sz="1"/>
+            </w:tcBorders>
+            <w:tcMar>
+              <w:top w:type="dxa" w:w="90"/>
+              <w:left w:type="dxa" w:w="140"/>
+              <w:bottom w:type="dxa" w:w="90"/>
+              <w:right w:type="dxa" w:w="140"/>
+            </w:tcMar>
+            <w:vAlign w:val="top"/>
+          </w:tcPr>
+          <w:p>
+            <w:pPr>
+              <w:spacing w:after="0" w:before="0"/>
+              <w:jc w:val="left"/>
+            </w:pPr>
+            <w:r>
+              <w:rPr>
+                <w:rFonts w:ascii="Arial" w:cs="Arial" w:eastAsia="Arial" w:hAnsi="Arial"/>
+                <w:b w:val="false"/>
+                <w:bCs w:val="false"/>
+                <w:i w:val="false"/>
+                <w:iCs w:val="false"/>
+                <w:color w:val="1E293B"/>
+                <w:sz w:val="19"/>
+                <w:szCs w:val="19"/>
+              </w:rPr>
+              <w:t xml:space="preserve">Chuẩn — tương thích ecosystem rộng</w:t>
+            </w:r>
+          </w:p>
+        </w:tc>
+        <w:tc>
+          <w:tcPr>
+            <w:tcW w:type="dxa" w:w="3360"/>
+            <w:tcBorders>
+              <w:top w:val="single" w:color="CBD5E1" w:sz="1"/>
+              <w:left w:val="single" w:color="CBD5E1" w:sz="1"/>
+              <w:bottom w:val="single" w:color="CBD5E1" w:sz="1"/>
+              <w:right w:val="single" w:color="CBD5E1" w:sz="1"/>
+            </w:tcBorders>
+            <w:tcMar>
+              <w:top w:type="dxa" w:w="90"/>
+              <w:left w:type="dxa" w:w="140"/>
+              <w:bottom w:type="dxa" w:w="90"/>
+              <w:right w:type="dxa" w:w="140"/>
+            </w:tcMar>
+            <w:vAlign w:val="top"/>
+          </w:tcPr>
+          <w:p>
+            <w:pPr>
+              <w:spacing w:after="0" w:before="0"/>
+              <w:jc w:val="left"/>
+            </w:pPr>
+            <w:r>
+              <w:rPr>
+                <w:rFonts w:ascii="Arial" w:cs="Arial" w:eastAsia="Arial" w:hAnsi="Arial"/>
+                <w:b w:val="false"/>
+                <w:bCs w:val="false"/>
+                <w:i w:val="false"/>
+                <w:iCs w:val="false"/>
+                <w:color w:val="1E293B"/>
+                <w:sz w:val="19"/>
+                <w:szCs w:val="19"/>
+              </w:rPr>
+              <w:t xml:space="preserve">MCP-compatible: cùng endpoint convention, cùng schema format</w:t>
+            </w:r>
+          </w:p>
+        </w:tc>
+      </w:tr>
+    </w:tbl>
+    <w:p>
+      <w:pPr>
+        <w:spacing w:after="80" w:before="0"/>
+      </w:pPr>
+      <w:r>
+        <w:rPr>
+          <w:rFonts w:ascii="Arial" w:cs="Arial" w:eastAsia="Arial" w:hAnsi="Arial"/>
+          <w:b w:val="false"/>
+          <w:bCs w:val="false"/>
+          <w:i w:val="false"/>
+          <w:iCs w:val="false"/>
+          <w:color w:val="1E293B"/>
+          <w:sz w:val="22"/>
+          <w:szCs w:val="22"/>
+        </w:rPr>
+        <w:t xml:space="preserve"/>
+      </w:r>
+    </w:p>
+    <w:tbl>
+      <w:tblPr>
+        <w:tblW w:type="dxa" w:w="9360"/>
+        <w:tblBorders>
+          <w:top w:val="single" w:color="auto" w:sz="4"/>
+          <w:left w:val="single" w:color="auto" w:sz="4"/>
+          <w:bottom w:val="single" w:color="auto" w:sz="4"/>
+          <w:right w:val="single" w:color="auto" w:sz="4"/>
+          <w:insideH w:val="single" w:color="auto" w:sz="4"/>
+          <w:insideV w:val="single" w:color="auto" w:sz="4"/>
+        </w:tblBorders>
+      </w:tblPr>
+      <w:tblGrid>
+        <w:gridCol w:w="9360"/>
+      </w:tblGrid>
+      <w:tr>
+        <w:tc>
+          <w:tcPr>
+            <w:tcW w:type="dxa" w:w="9360"/>
+            <w:tcBorders>
+              <w:top w:val="single" w:color="94A3B8" w:sz="3"/>
+              <w:left w:val="thick" w:color="94A3B8" w:sz="14"/>
+              <w:bottom w:val="single" w:color="94A3B8" w:sz="3"/>
+              <w:right w:val="single" w:color="E2E8F0" w:sz="2"/>
+            </w:tcBorders>
+            <w:shd w:fill="F1F5F9" w:val="clear"/>
+            <w:tcMar>
+              <w:top w:type="dxa" w:w="130"/>
+              <w:left w:type="dxa" w:w="220"/>
+              <w:bottom w:type="dxa" w:w="130"/>
+              <w:right w:type="dxa" w:w="220"/>
+            </w:tcMar>
+          </w:tcPr>
+          <w:p>
+            <w:pPr>
+              <w:spacing w:after="60" w:before="0" w:line="276"/>
+              <w:jc w:val="left"/>
+            </w:pPr>
+            <w:r>
+              <w:rPr>
+                <w:rFonts w:ascii="Arial" w:cs="Arial" w:eastAsia="Arial" w:hAnsi="Arial"/>
+                <w:b/>
+                <w:bCs/>
+                <w:i w:val="false"/>
+                <w:iCs w:val="false"/>
+                <w:color w:val="1E293B"/>
+                <w:sz w:val="20"/>
+                <w:szCs w:val="20"/>
+              </w:rPr>
+              <w:t xml:space="preserve">Kết luận: </w:t>
+            </w:r>
+            <w:r>
+              <w:rPr>
+                <w:rFonts w:ascii="Arial" w:cs="Arial" w:eastAsia="Arial" w:hAnsi="Arial"/>
+                <w:b w:val="false"/>
+                <w:bCs w:val="false"/>
+                <w:i w:val="false"/>
+                <w:iCs w:val="false"/>
+                <w:color w:val="1E293B"/>
+                <w:sz w:val="20"/>
+                <w:szCs w:val="20"/>
+              </w:rPr>
+              <w:t xml:space="preserve">Tool Registry HTTP API đã follow MCP convention (GET /tools + POST /tools/execute + OpenAI tool schema). Không cần MCP SDK cho MVP — 2 agent cùng mạng, plain HTTP đủ. Khi cần tích hợp external MCP server hoặc cho Claude.ai/Cursor gọi trực tiếp → upgrade transport layer sau mà không cần đổi interface.</w:t>
+            </w:r>
+          </w:p>
+          <w:p>
+            <w:pPr>
+              <w:spacing w:after="0" w:before="0" w:line="276"/>
+              <w:jc w:val="left"/>
+            </w:pPr>
+            <w:r>
+              <w:rPr>
+                <w:rFonts w:ascii="Arial" w:cs="Arial" w:eastAsia="Arial" w:hAnsi="Arial"/>
+                <w:b/>
+                <w:bCs/>
+                <w:i w:val="false"/>
+                <w:iCs w:val="false"/>
+                <w:color w:val="475569"/>
+                <w:sz w:val="20"/>
+                <w:szCs w:val="20"/>
+              </w:rPr>
+              <w:t xml:space="preserve">Post-MVP backlog: </w:t>
+            </w:r>
+            <w:r>
+              <w:rPr>
+                <w:rFonts w:ascii="Arial" w:cs="Arial" w:eastAsia="Arial" w:hAnsi="Arial"/>
+                <w:b w:val="false"/>
+                <w:bCs w:val="false"/>
+                <w:i w:val="false"/>
+                <w:iCs w:val="false"/>
+                <w:color w:val="475569"/>
+                <w:sz w:val="20"/>
+                <w:szCs w:val="20"/>
+              </w:rPr>
+              <w:t xml:space="preserve">Wrap Tool Registry bằng FastMCP để expose chuẩn MCP — tương thích với bất kỳ MCP client nào trong ecosystem.</w:t>
             </w:r>
           </w:p>
         </w:tc>

</xml_diff>